<commit_message>
chore: utils and copyright material updates
</commit_message>
<xml_diff>
--- a/copyright/软件著作权申请资料/正式资料/ZDEM盐体运动学分析系统_操作手册.docx
+++ b/copyright/软件著作权申请资料/正式资料/ZDEM盐体运动学分析系统_操作手册.docx
@@ -21,194 +21,7 @@
         <w:rPr>
           <w:color w:val="000000"/>
         </w:rPr>
-        <w:t>一、相关文档</w:t>
-      </w:r>
-    </w:p>
-    <w:tbl>
-      <w:tblPr>
-        <w:tblStyle w:val="TableGrid"/>
-        <w:tblW w:type="auto" w:w="0"/>
-        <w:tblLook w:firstColumn="1" w:firstRow="1" w:lastColumn="0" w:lastRow="0" w:noHBand="0" w:noVBand="1" w:val="04A0"/>
-      </w:tblPr>
-      <w:tblGrid>
-        <w:gridCol w:w="2890"/>
-        <w:gridCol w:w="2890"/>
-        <w:gridCol w:w="2890"/>
-      </w:tblGrid>
-      <w:tr>
-        <w:tc>
-          <w:tcPr>
-            <w:tcW w:type="dxa" w:w="2890"/>
-          </w:tcPr>
-          <w:p>
-            <w:r>
-              <w:rPr>
-                <w:color w:val="000000"/>
-              </w:rPr>
-              <w:t>文档名称</w:t>
-            </w:r>
-          </w:p>
-        </w:tc>
-        <w:tc>
-          <w:tcPr>
-            <w:tcW w:type="dxa" w:w="2890"/>
-          </w:tcPr>
-          <w:p>
-            <w:r>
-              <w:rPr>
-                <w:color w:val="000000"/>
-              </w:rPr>
-              <w:t>指向资料</w:t>
-            </w:r>
-          </w:p>
-        </w:tc>
-        <w:tc>
-          <w:tcPr>
-            <w:tcW w:type="dxa" w:w="2890"/>
-          </w:tcPr>
-          <w:p>
-            <w:r>
-              <w:rPr>
-                <w:color w:val="000000"/>
-              </w:rPr>
-              <w:t>说明</w:t>
-            </w:r>
-          </w:p>
-        </w:tc>
-      </w:tr>
-      <w:tr>
-        <w:tc>
-          <w:tcPr>
-            <w:tcW w:type="dxa" w:w="2890"/>
-          </w:tcPr>
-          <w:p>
-            <w:r>
-              <w:rPr>
-                <w:color w:val="000000"/>
-              </w:rPr>
-              <w:t>总体设计</w:t>
-            </w:r>
-          </w:p>
-        </w:tc>
-        <w:tc>
-          <w:tcPr>
-            <w:tcW w:type="dxa" w:w="2890"/>
-          </w:tcPr>
-          <w:p>
-            <w:r>
-              <w:rPr>
-                <w:color w:val="000000"/>
-              </w:rPr>
-              <w:t>《总体设计》</w:t>
-            </w:r>
-          </w:p>
-        </w:tc>
-        <w:tc>
-          <w:tcPr>
-            <w:tcW w:type="dxa" w:w="2890"/>
-          </w:tcPr>
-          <w:p>
-            <w:r>
-              <w:rPr>
-                <w:color w:val="000000"/>
-              </w:rPr>
-              <w:t>说明软件整体功能、页面组成、运行环境和业务边界。</w:t>
-            </w:r>
-          </w:p>
-        </w:tc>
-      </w:tr>
-      <w:tr>
-        <w:tc>
-          <w:tcPr>
-            <w:tcW w:type="dxa" w:w="2890"/>
-          </w:tcPr>
-          <w:p>
-            <w:r>
-              <w:rPr>
-                <w:color w:val="000000"/>
-              </w:rPr>
-              <w:t>详细设计</w:t>
-            </w:r>
-          </w:p>
-        </w:tc>
-        <w:tc>
-          <w:tcPr>
-            <w:tcW w:type="dxa" w:w="2890"/>
-          </w:tcPr>
-          <w:p>
-            <w:r>
-              <w:rPr>
-                <w:color w:val="000000"/>
-              </w:rPr>
-              <w:t>《详细设计》</w:t>
-            </w:r>
-          </w:p>
-        </w:tc>
-        <w:tc>
-          <w:tcPr>
-            <w:tcW w:type="dxa" w:w="2890"/>
-          </w:tcPr>
-          <w:p>
-            <w:r>
-              <w:rPr>
-                <w:color w:val="000000"/>
-              </w:rPr>
-              <w:t>说明各功能页面、输入输出、状态变化和处理规则。</w:t>
-            </w:r>
-          </w:p>
-        </w:tc>
-      </w:tr>
-      <w:tr>
-        <w:tc>
-          <w:tcPr>
-            <w:tcW w:type="dxa" w:w="2890"/>
-          </w:tcPr>
-          <w:p>
-            <w:r>
-              <w:rPr>
-                <w:color w:val="000000"/>
-              </w:rPr>
-              <w:t>测试案例</w:t>
-            </w:r>
-          </w:p>
-        </w:tc>
-        <w:tc>
-          <w:tcPr>
-            <w:tcW w:type="dxa" w:w="2890"/>
-          </w:tcPr>
-          <w:p>
-            <w:r>
-              <w:rPr>
-                <w:color w:val="000000"/>
-              </w:rPr>
-              <w:t>《测试案例》</w:t>
-            </w:r>
-          </w:p>
-        </w:tc>
-        <w:tc>
-          <w:tcPr>
-            <w:tcW w:type="dxa" w:w="2890"/>
-          </w:tcPr>
-          <w:p>
-            <w:r>
-              <w:rPr>
-                <w:color w:val="000000"/>
-              </w:rPr>
-              <w:t>记录主要功能的操作场景、预期结果和异常提示。</w:t>
-            </w:r>
-          </w:p>
-        </w:tc>
-      </w:tr>
-    </w:tbl>
-    <w:p>
-      <w:pPr>
-        <w:pStyle w:val="Heading2"/>
-      </w:pPr>
-      <w:r>
-        <w:rPr>
-          <w:color w:val="000000"/>
-        </w:rPr>
-        <w:t>二、说明</w:t>
+        <w:t>软件概述</w:t>
       </w:r>
     </w:p>
     <w:p>
@@ -218,7 +31,7 @@
           <w:color w:val="000000"/>
           <w:sz w:val="21"/>
         </w:rPr>
-        <w:t>ZDEM盐体运动学分析系统 V1.0.0适用于构造地质学/盐构造研究/地球科学场景。用户进入系统后，可以围绕实际工作内容完成账号进入、业务创建、过程查看、结果确认和资料管理等操作。</w:t>
+        <w:t>本软件用于对ZDEM离散元模拟输出数据进行盐体运动学自动化分析，从原始粒子数据中提取盐丘几何形态演化指标并生成学术级诊断图表。</w:t>
       </w:r>
     </w:p>
     <w:p>
@@ -228,7 +41,7 @@
           <w:color w:val="000000"/>
           <w:sz w:val="21"/>
         </w:rPr>
-        <w:t>日常使用时，构造地质学研究人员、盐构造与盐丘演化研究学者、地球物理学与盆地模拟研究人员、石油地质与油气勘探工程技术人员可以按照页面提示从入口进入相应页面，查看当前业务状态，并根据页面中的按钮、输入框、列表或弹窗继续处理。替代传统人工逐帧测量方式，实现盐体运动学指标的自动化批量提取与可视化，大幅提升构造缩短模拟数据的分析效率和分析结果的一致性。</w:t>
+        <w:t>1）批量数据提取：用于读取用户整理的ZDEM实验组数据目录，自动扫描各实验组data子目录中的.dat原始粒子文件，解析颗粒坐标与组别信息，通过水平分箱统计提取盐体表面包络线，识别盐丘主峰顶点与边缘向斜基点，计算宽度、起伏和高宽比三项运动学指标，结果保存为CSV表格和PKL缓存文件。</w:t>
       </w:r>
     </w:p>
     <w:p>
@@ -238,7 +51,7 @@
           <w:color w:val="000000"/>
           <w:sz w:val="21"/>
         </w:rPr>
-        <w:t>面向构造地质学与盐构造研究领域，专为 ZDEM 离散元模拟数据设计的盐体运动学自动化分析系统。从数万颗粒的原始模拟数据中自动提取盐丘几何形态演化指标，生成符合学术出版标准的诊断图表。</w:t>
+        <w:t>2）智能特征点定位：用于从平滑后的包络线中自动定位盐丘主峰与边缘基点。主峰识别采用SciPy峰值检测算法结合Prominence阈值筛选最显著峰值；基点识别采用坑底探测与反弹判定算法，从峰顶向推板反方向扫描追踪局部极小值，当连续反弹超过设定阈值时锁定基点位置。该功能可自动处理数万颗粒的剖面数据，无需人工逐帧测量。</w:t>
       </w:r>
     </w:p>
     <w:p>
@@ -248,7 +61,7 @@
           <w:color w:val="000000"/>
           <w:sz w:val="21"/>
         </w:rPr>
-        <w:t>本手册为 ZDEM Salt Kinematics 盐体运动学分析系统的操作说明，配套文档如下：</w:t>
+        <w:t>3）交互式质控修正：用于对自动识别结果进行人工检查和校准。软件以Matplotlib图形窗口逐帧展示盐体粒子分布和算法识别的主峰、基点标记，用户可通过鼠标左键点击盐体表面重新设定基点坐标，右键撤销上一步操作，按S键或Enter键保存修正并自动切换下一帧。该功能用于修正算法在复杂边界条件下可能出现的误判。</w:t>
       </w:r>
     </w:p>
     <w:p>
@@ -258,7 +71,7 @@
           <w:color w:val="000000"/>
           <w:sz w:val="21"/>
         </w:rPr>
-        <w:t>ZDEM Salt Kinematics 是一套盐体运动学自动分析软件。构造地质学研究者在进行盐构造离散元模拟实验后，会得到大量按时间步编号的粒子坐标数据文件。传统方式需要研究者逐帧人工测量盐丘的高度和宽度，工作量大且结果依赖操作者主观判断。本软件将这一过程自动化：用户只需按实验组整理好数据，运行软件即可自动提取每个时刻的盐体几何形态指标，并生成可供论文直接使用的诊断图表。软件还提供了交互式质控界面，允许用户对算法自动识别结果进行检查和微调。</w:t>
+        <w:t>4）单组诊断绘图：用于为单个实验组生成运动学演化轨迹图和盐体剖面多宫格诊断图。演化轨迹图展示高宽比随缩短量变化的曲线，剖面诊断图以多宫格形式展示不同时刻步的盐体轮廓与特征点叠加效果，输出为600 DPI高分辨率PNG文件。</w:t>
       </w:r>
     </w:p>
     <w:p>
@@ -268,27 +81,7 @@
           <w:color w:val="000000"/>
           <w:sz w:val="21"/>
         </w:rPr>
-        <w:t>本软件的核心功能包括：批量解析离散元模拟原始数据，自动识别盐丘主峰顶点与边缘向斜边界；计算每帧的盐体宽度、起伏和高宽比三个运动学指标；提供交互式质控界面，允许用户通过鼠标点击修正算法自动识别的基点；生成高分辨率的演化轨迹图和剖面诊断图；支持多个实验组的联合比对，输出可用于学术论文的对比图。</w:t>
-      </w:r>
-    </w:p>
-    <w:p>
-      <w:r>
-        <w:rPr>
-          <w:rFonts w:ascii="SimSun" w:hAnsi="SimSun" w:eastAsia="SimSun"/>
-          <w:color w:val="000000"/>
-          <w:sz w:val="21"/>
-        </w:rPr>
-        <w:t>运行本软件需要满足以下环境条件。</w:t>
-      </w:r>
-    </w:p>
-    <w:p>
-      <w:r>
-        <w:rPr>
-          <w:rFonts w:ascii="SimSun" w:hAnsi="SimSun" w:eastAsia="SimSun"/>
-          <w:color w:val="000000"/>
-          <w:sz w:val="21"/>
-        </w:rPr>
-        <w:t>本手册用于说明软件的用途、功能特点、运行要求和页面操作流程。各功能章节按用户能够看到的页面、入口、按钮、输入项、提示信息和处理结果进行说明。</w:t>
+        <w:t>5）多组联合比对：用于将所有实验组的运动学指标绘制到同一坐标系中进行跨组对比。软件自动加载各组的CSV数据，按不同颜色和标记绘制宽度、起伏和高宽比的演化曲线，同时输出PNG位图和PDF矢量图两种格式，便于论文学术发表。</w:t>
       </w:r>
     </w:p>
     <w:p>
@@ -299,7 +92,7 @@
         <w:rPr>
           <w:color w:val="000000"/>
         </w:rPr>
-        <w:t>三、功能特点</w:t>
+        <w:t>运行环境</w:t>
       </w:r>
     </w:p>
     <w:p>
@@ -309,47 +102,7 @@
           <w:color w:val="000000"/>
           <w:sz w:val="21"/>
         </w:rPr>
-        <w:t>用户可在环境配置页面安装 Python 依赖包并完成运行参数配置，是使用本软件的前置步骤。页面上的终端命令行界面和.env配置文件（文本格式，包含FINAL_OUTPUT_DIR数据目录路径、EXPERIMENT_GROUPS实验组定义等参数）会集中呈现当前可操作内容，用户处理完成后可以看到终端执行pip install成功后显示各依赖包的安装完成信息和配置文件保存后软件在后续运行时自动读取，运行日志中会显示已加载的实验组名称和路径。</w:t>
-      </w:r>
-    </w:p>
-    <w:p>
-      <w:r>
-        <w:rPr>
-          <w:rFonts w:ascii="SimSun" w:hAnsi="SimSun" w:eastAsia="SimSun"/>
-          <w:color w:val="000000"/>
-          <w:sz w:val="21"/>
-        </w:rPr>
-        <w:t>在数据提取页面中，用户主要处理批量解析各实验组的.dat原始粒子数据，自动计算每帧的运动学指标并输出 CSV 表格和缓存文件。系统把终端显示处理进度条（tqdm进度条）、终端日志输出，格式为HH:MM:SS [LEVEL] message和终端显示每组的文件数量、采样进度和采样后帧数放在当前操作区域，处理结束后会反馈终端实时显示 tqdm 进度条，反映当前处理的组别和文件数量、日志输出每组处理完成信息，显示原始帧数和采样后帧数和处理完成后在实验组目录下生成kinematics_data.csv和profiles_cache.pkl文件。</w:t>
-      </w:r>
-    </w:p>
-    <w:p>
-      <w:r>
-        <w:rPr>
-          <w:rFonts w:ascii="SimSun" w:hAnsi="SimSun" w:eastAsia="SimSun"/>
-          <w:color w:val="000000"/>
-          <w:sz w:val="21"/>
-        </w:rPr>
-        <w:t>交互式质控修正页面关注的是以交互式图形界面逐帧展示算法识别结果，支持用户通过鼠标点击修正基点位置。用户通过 Matplotlib 图形窗口，显示当前帧的盐体粒子分布散点图、算法自动识别的峰顶位置（标记点）、算法自动识别的基点位置（标记点）和底部显示当前帧编号、快捷键提示和操作状态确认当前状态，并在操作结束后获得鼠标左键点击后基点标记立即移动到新位置、右下角状态区域显示当前帧号和操作提示和按 S 键后显示'已保存'提示并自动切换到下一帧。</w:t>
-      </w:r>
-    </w:p>
-    <w:p>
-      <w:r>
-        <w:rPr>
-          <w:rFonts w:ascii="SimSun" w:hAnsi="SimSun" w:eastAsia="SimSun"/>
-          <w:color w:val="000000"/>
-          <w:sz w:val="21"/>
-        </w:rPr>
-        <w:t>用户可在单组诊断绘图页面为每个实验组生成运动学演化轨迹图和盐体剖面多宫格诊断图。页面上的终端显示各组绘图进度日志和输出目录中出现 PNG 格式图表文件会集中呈现当前可操作内容，用户处理完成后可以看到终端日志显示每个实验组的绘图进度和完成后在实验组目录中可查看生成的 PNG 图表文件。</w:t>
-      </w:r>
-    </w:p>
-    <w:p>
-      <w:r>
-        <w:rPr>
-          <w:rFonts w:ascii="SimSun" w:hAnsi="SimSun" w:eastAsia="SimSun"/>
-          <w:color w:val="000000"/>
-          <w:sz w:val="21"/>
-        </w:rPr>
-        <w:t>在多组联合比对页面中，用户主要处理将所有实验组的运动学指标绘制到同一张对比图中，支持跨组比较分析。系统把终端显示各组数据加载和绘图进度日志和输出目录中出现多组对比的 PNG 和 PDF 图表文件放在当前操作区域，处理结束后会反馈终端日志显示当前处理的数据组和绘图完成信息和完成后在输出目录中可查看Multi_Evolution系列图表文件。</w:t>
+        <w:t>软件可在安装Python 3.9及以上版本的科学计算环境中运行，依赖NumPy、SciPy、Pandas、Matplotlib、tqdm和python-dotenv。也可通过Docker容器运行。</w:t>
       </w:r>
     </w:p>
     <w:p>
@@ -360,226 +113,9 @@
         <w:rPr>
           <w:color w:val="000000"/>
         </w:rPr>
-        <w:t>四、系统要求</w:t>
+        <w:t>典型使用流程</w:t>
       </w:r>
     </w:p>
-    <w:tbl>
-      <w:tblPr>
-        <w:tblStyle w:val="TableGrid"/>
-        <w:tblW w:type="auto" w:w="0"/>
-        <w:tblLook w:firstColumn="1" w:firstRow="1" w:lastColumn="0" w:lastRow="0" w:noHBand="0" w:noVBand="1" w:val="04A0"/>
-      </w:tblPr>
-      <w:tblGrid>
-        <w:gridCol w:w="2890"/>
-        <w:gridCol w:w="2890"/>
-        <w:gridCol w:w="2890"/>
-      </w:tblGrid>
-      <w:tr>
-        <w:tc>
-          <w:tcPr>
-            <w:tcW w:type="dxa" w:w="2890"/>
-          </w:tcPr>
-          <w:p>
-            <w:r>
-              <w:rPr>
-                <w:color w:val="000000"/>
-              </w:rPr>
-              <w:t>系统要求</w:t>
-            </w:r>
-          </w:p>
-        </w:tc>
-        <w:tc>
-          <w:tcPr>
-            <w:tcW w:type="dxa" w:w="2890"/>
-          </w:tcPr>
-          <w:p>
-            <w:r>
-              <w:rPr>
-                <w:color w:val="000000"/>
-              </w:rPr>
-              <w:t>最低配置</w:t>
-            </w:r>
-          </w:p>
-        </w:tc>
-        <w:tc>
-          <w:tcPr>
-            <w:tcW w:type="dxa" w:w="2890"/>
-          </w:tcPr>
-          <w:p>
-            <w:r>
-              <w:rPr>
-                <w:color w:val="000000"/>
-              </w:rPr>
-              <w:t>推荐配置</w:t>
-            </w:r>
-          </w:p>
-        </w:tc>
-      </w:tr>
-      <w:tr>
-        <w:tc>
-          <w:tcPr>
-            <w:tcW w:type="dxa" w:w="2890"/>
-          </w:tcPr>
-          <w:p>
-            <w:r>
-              <w:rPr>
-                <w:color w:val="000000"/>
-              </w:rPr>
-              <w:t>操作系统</w:t>
-            </w:r>
-          </w:p>
-        </w:tc>
-        <w:tc>
-          <w:tcPr>
-            <w:tcW w:type="dxa" w:w="2890"/>
-          </w:tcPr>
-          <w:p>
-            <w:r>
-              <w:rPr>
-                <w:color w:val="000000"/>
-              </w:rPr>
-              <w:t>Windows 10 / macOS 11 / Linux (内核4.x+)</w:t>
-            </w:r>
-          </w:p>
-        </w:tc>
-        <w:tc>
-          <w:tcPr>
-            <w:tcW w:type="dxa" w:w="2890"/>
-          </w:tcPr>
-          <w:p>
-            <w:r>
-              <w:rPr>
-                <w:color w:val="000000"/>
-              </w:rPr>
-              <w:t>Windows 11 / macOS 14+ / Ubuntu 22.04+</w:t>
-            </w:r>
-          </w:p>
-        </w:tc>
-      </w:tr>
-      <w:tr>
-        <w:tc>
-          <w:tcPr>
-            <w:tcW w:type="dxa" w:w="2890"/>
-          </w:tcPr>
-          <w:p>
-            <w:r>
-              <w:rPr>
-                <w:color w:val="000000"/>
-              </w:rPr>
-              <w:t>Python版本</w:t>
-            </w:r>
-          </w:p>
-        </w:tc>
-        <w:tc>
-          <w:tcPr>
-            <w:tcW w:type="dxa" w:w="2890"/>
-          </w:tcPr>
-          <w:p>
-            <w:r>
-              <w:rPr>
-                <w:color w:val="000000"/>
-              </w:rPr>
-              <w:t>Python 3.9</w:t>
-            </w:r>
-          </w:p>
-        </w:tc>
-        <w:tc>
-          <w:tcPr>
-            <w:tcW w:type="dxa" w:w="2890"/>
-          </w:tcPr>
-          <w:p>
-            <w:r>
-              <w:rPr>
-                <w:color w:val="000000"/>
-              </w:rPr>
-              <w:t>Python 3.11+</w:t>
-            </w:r>
-          </w:p>
-        </w:tc>
-      </w:tr>
-      <w:tr>
-        <w:tc>
-          <w:tcPr>
-            <w:tcW w:type="dxa" w:w="2890"/>
-          </w:tcPr>
-          <w:p>
-            <w:r>
-              <w:rPr>
-                <w:color w:val="000000"/>
-              </w:rPr>
-              <w:t>内存</w:t>
-            </w:r>
-          </w:p>
-        </w:tc>
-        <w:tc>
-          <w:tcPr>
-            <w:tcW w:type="dxa" w:w="2890"/>
-          </w:tcPr>
-          <w:p>
-            <w:r>
-              <w:rPr>
-                <w:color w:val="000000"/>
-              </w:rPr>
-              <w:t>4 GB</w:t>
-            </w:r>
-          </w:p>
-        </w:tc>
-        <w:tc>
-          <w:tcPr>
-            <w:tcW w:type="dxa" w:w="2890"/>
-          </w:tcPr>
-          <w:p>
-            <w:r>
-              <w:rPr>
-                <w:color w:val="000000"/>
-              </w:rPr>
-              <w:t>8 GB以上（处理万级粒子数据时建议16 GB）</w:t>
-            </w:r>
-          </w:p>
-        </w:tc>
-      </w:tr>
-      <w:tr>
-        <w:tc>
-          <w:tcPr>
-            <w:tcW w:type="dxa" w:w="2890"/>
-          </w:tcPr>
-          <w:p>
-            <w:r>
-              <w:rPr>
-                <w:color w:val="000000"/>
-              </w:rPr>
-              <w:t>硬盘空间</w:t>
-            </w:r>
-          </w:p>
-        </w:tc>
-        <w:tc>
-          <w:tcPr>
-            <w:tcW w:type="dxa" w:w="2890"/>
-          </w:tcPr>
-          <w:p>
-            <w:r>
-              <w:rPr>
-                <w:color w:val="000000"/>
-              </w:rPr>
-              <w:t>500 MB（不含模拟数据）</w:t>
-            </w:r>
-          </w:p>
-        </w:tc>
-        <w:tc>
-          <w:tcPr>
-            <w:tcW w:type="dxa" w:w="2890"/>
-          </w:tcPr>
-          <w:p>
-            <w:r>
-              <w:rPr>
-                <w:color w:val="000000"/>
-              </w:rPr>
-              <w:t>2 GB以上</w:t>
-            </w:r>
-          </w:p>
-        </w:tc>
-      </w:tr>
-    </w:tbl>
     <w:p>
       <w:r>
         <w:rPr>
@@ -587,7 +123,67 @@
           <w:color w:val="000000"/>
           <w:sz w:val="21"/>
         </w:rPr>
-        <w:t>请确保实际运行环境满足以上要求，以保证 ZDEM 盐体运动学分析系统能够正常打开页面、提交操作和展示处理结果。若部署方式、客户端形态或服务器环境与本表不同，应以实际确认的申请表环境字段为准。</w:t>
+        <w:t>ZDEM盐体运动学分析系统的典型使用流程按照标准数据流水线组织，审核人员可通过该流程理解各功能之间的衔接关系。</w:t>
+      </w:r>
+    </w:p>
+    <w:p>
+      <w:r>
+        <w:rPr>
+          <w:rFonts w:ascii="SimSun" w:hAnsi="SimSun" w:eastAsia="SimSun"/>
+          <w:color w:val="000000"/>
+          <w:sz w:val="21"/>
+        </w:rPr>
+        <w:t>1）将ZDEM模拟数据按实验组整理到数据目录中，每个实验组子目录下包含data子文件夹，存放按时间步编号的.dat文件。</w:t>
+      </w:r>
+    </w:p>
+    <w:p>
+      <w:r>
+        <w:rPr>
+          <w:rFonts w:ascii="SimSun" w:hAnsi="SimSun" w:eastAsia="SimSun"/>
+          <w:color w:val="000000"/>
+          <w:sz w:val="21"/>
+        </w:rPr>
+        <w:t>2）复制.env.example为.env，修改FINAL_OUTPUT_DIR指向实际数据目录，配置EXPERIMENT_GROUPS实验组参数。</w:t>
+      </w:r>
+    </w:p>
+    <w:p>
+      <w:r>
+        <w:rPr>
+          <w:rFonts w:ascii="SimSun" w:hAnsi="SimSun" w:eastAsia="SimSun"/>
+          <w:color w:val="000000"/>
+          <w:sz w:val="21"/>
+        </w:rPr>
+        <w:t>3）执行python 01_data_extractor.py，批量解析.dat文件并提取运动学指标，生成CSV和PKL缓存。</w:t>
+      </w:r>
+    </w:p>
+    <w:p>
+      <w:r>
+        <w:rPr>
+          <w:rFonts w:ascii="SimSun" w:hAnsi="SimSun" w:eastAsia="SimSun"/>
+          <w:color w:val="000000"/>
+          <w:sz w:val="21"/>
+        </w:rPr>
+        <w:t>4）执行python 01b_manual_corrector.py，在交互式图形界面中逐帧检查并修正基点定位。</w:t>
+      </w:r>
+    </w:p>
+    <w:p>
+      <w:r>
+        <w:rPr>
+          <w:rFonts w:ascii="SimSun" w:hAnsi="SimSun" w:eastAsia="SimSun"/>
+          <w:color w:val="000000"/>
+          <w:sz w:val="21"/>
+        </w:rPr>
+        <w:t>5）执行python 02_plot_single_diagnostic.py，为每个实验组生成演化轨迹图和剖面诊断图。</w:t>
+      </w:r>
+    </w:p>
+    <w:p>
+      <w:r>
+        <w:rPr>
+          <w:rFonts w:ascii="SimSun" w:hAnsi="SimSun" w:eastAsia="SimSun"/>
+          <w:color w:val="000000"/>
+          <w:sz w:val="21"/>
+        </w:rPr>
+        <w:t>6）执行python 03_plot_multi_comparison.py，生成所有实验组的宽度、起伏、高宽比联合对比图。</w:t>
       </w:r>
     </w:p>
     <w:p>
@@ -598,7 +194,7 @@
         <w:rPr>
           <w:color w:val="000000"/>
         </w:rPr>
-        <w:t>五、环境配置</w:t>
+        <w:t>主要功能说明</w:t>
       </w:r>
     </w:p>
     <w:p>
@@ -608,7 +204,18 @@
           <w:color w:val="000000"/>
           <w:sz w:val="21"/>
         </w:rPr>
-        <w:t>用户可在环境配置页面安装 Python 依赖包并完成运行参数配置，是使用本软件的前置步骤。用户在终端中进入软件根目录，首先执行pip install -r requirements.txt安装依赖，然后将.env.example复制为.env并编辑。</w:t>
+        <w:t>软件围绕数据提取、特征点定位、交互质控、单组诊断绘图和多组联合比对组织功能。</w:t>
+      </w:r>
+    </w:p>
+    <w:p>
+      <w:pPr>
+        <w:pStyle w:val="Heading3"/>
+      </w:pPr>
+      <w:r>
+        <w:rPr>
+          <w:color w:val="000000"/>
+        </w:rPr>
+        <w:t>1. 环境配置</w:t>
       </w:r>
     </w:p>
     <w:p>
@@ -618,7 +225,7 @@
           <w:color w:val="000000"/>
           <w:sz w:val="21"/>
         </w:rPr>
-        <w:t>用户首次使用软件时需要配置运行环境。用户在终端中执行安装命令，然后编辑配置文件指定数据目录路径和实验组信息。</w:t>
+        <w:t>用户首次使用前需要安装依赖包并配置运行参数。软件通过.env配置文件管理数据目录路径、实验组定义、算法参数和视觉样式等所有运行参数，用户将模板文件.env.example复制为.env后编辑相应字段即可。</w:t>
       </w:r>
     </w:p>
     <w:p>
@@ -628,7 +235,7 @@
           <w:color w:val="000000"/>
           <w:sz w:val="21"/>
         </w:rPr>
-        <w:t>用户在环境配置页面会看到终端命令行界面和.env配置文件（文本格式，包含FINAL_OUTPUT_DIR数据目录路径、EXPERIMENT_GROUPS实验组定义等参数）等信息，并可依据页面显示继续处理。</w:t>
+        <w:t>该功能是后续所有数据分析和图形输出的入口。若配置文件缺失或路径无效，软件会在启动时给出报错提示，用户可根据提示检查并修改.env文件。</w:t>
       </w:r>
     </w:p>
     <w:p>
@@ -638,7 +245,7 @@
           <w:color w:val="000000"/>
           <w:sz w:val="21"/>
         </w:rPr>
-        <w:t>使用该功能时，用户先在终端中进入软件根目录，随后执行pip install -r requirements.txt安装科学计算依赖，接着将模板文件.env.example复制为.env，之后使用文本编辑器打开.env文件，修改FINAL_OUTPUT_DIR为实际数据存放路径，再在EXPERIMENT_GROUPS字段中按 JSON 格式配置实验组的名称、子目录、标签和图表样式，最后保存并关闭.env文件。</w:t>
+        <w:t>操作步骤：</w:t>
       </w:r>
     </w:p>
     <w:p>
@@ -648,7 +255,67 @@
           <w:color w:val="000000"/>
           <w:sz w:val="21"/>
         </w:rPr>
-        <w:t>页面会按照FINAL_OUTPUT_DIR必须指向实际存在的数据目录、每个实验组的子目录下必须存在 data 子文件夹和 Python 版本须为3.9或更高等规则限制或提示用户。处理结束后，用户可以看到终端执行pip install成功后显示各依赖包的安装完成信息和配置文件保存后软件在后续运行时自动读取，运行日志中会显示已加载的实验组名称和路径。</w:t>
+        <w:t>1）在终端中进入软件根目录。</w:t>
+      </w:r>
+    </w:p>
+    <w:p>
+      <w:r>
+        <w:rPr>
+          <w:rFonts w:ascii="SimSun" w:hAnsi="SimSun" w:eastAsia="SimSun"/>
+          <w:color w:val="000000"/>
+          <w:sz w:val="21"/>
+        </w:rPr>
+        <w:t>2）执行pip install -r requirements.txt安装NumPy、SciPy、Pandas、Matplotlib等依赖。</w:t>
+      </w:r>
+    </w:p>
+    <w:p>
+      <w:r>
+        <w:rPr>
+          <w:rFonts w:ascii="SimSun" w:hAnsi="SimSun" w:eastAsia="SimSun"/>
+          <w:color w:val="000000"/>
+          <w:sz w:val="21"/>
+        </w:rPr>
+        <w:t>3）将.env.example复制为.env。</w:t>
+      </w:r>
+    </w:p>
+    <w:p>
+      <w:r>
+        <w:rPr>
+          <w:rFonts w:ascii="SimSun" w:hAnsi="SimSun" w:eastAsia="SimSun"/>
+          <w:color w:val="000000"/>
+          <w:sz w:val="21"/>
+        </w:rPr>
+        <w:t>4）用文本编辑器打开.env，修改FINAL_OUTPUT_DIR为实际数据目录路径。</w:t>
+      </w:r>
+    </w:p>
+    <w:p>
+      <w:r>
+        <w:rPr>
+          <w:rFonts w:ascii="SimSun" w:hAnsi="SimSun" w:eastAsia="SimSun"/>
+          <w:color w:val="000000"/>
+          <w:sz w:val="21"/>
+        </w:rPr>
+        <w:t>5）在EXPERIMENT_GROUPS字段中按JSON格式填写实验组的子目录路径、标签名称、颜色和标记符号。</w:t>
+      </w:r>
+    </w:p>
+    <w:p>
+      <w:r>
+        <w:rPr>
+          <w:rFonts w:ascii="SimSun" w:hAnsi="SimSun" w:eastAsia="SimSun"/>
+          <w:color w:val="000000"/>
+          <w:sz w:val="21"/>
+        </w:rPr>
+        <w:t>6）保存.env文件。</w:t>
+      </w:r>
+    </w:p>
+    <w:p>
+      <w:r>
+        <w:rPr>
+          <w:rFonts w:ascii="SimSun" w:hAnsi="SimSun" w:eastAsia="SimSun"/>
+          <w:color w:val="000000"/>
+          <w:sz w:val="21"/>
+        </w:rPr>
+        <w:t>完成配置后，运行数据提取脚本时会自动读取.env中的参数。</w:t>
       </w:r>
     </w:p>
     <w:p>
@@ -663,13 +330,13 @@
     </w:p>
     <w:p>
       <w:pPr>
-        <w:pStyle w:val="Heading2"/>
+        <w:pStyle w:val="Heading3"/>
       </w:pPr>
       <w:r>
         <w:rPr>
           <w:color w:val="000000"/>
         </w:rPr>
-        <w:t>六、数据提取</w:t>
+        <w:t>2. 数据提取</w:t>
       </w:r>
     </w:p>
     <w:p>
@@ -679,7 +346,7 @@
           <w:color w:val="000000"/>
           <w:sz w:val="21"/>
         </w:rPr>
-        <w:t>用户可在数据提取页面批量解析各实验组的.dat原始粒子数据，自动计算每帧的运动学指标并输出 CSV 表格和缓存文件。用户在终端中执行python 01_data_extractor.py命令启动数据提取过程。</w:t>
+        <w:t>数据提取功能用于批量解析ZDEM原始.dat文件，自动计算每帧的盐体运动学指标。软件按实验组遍历data子目录中的所有.dat文件，通过scipy.stats.binned_statistic对粒子云进行水平向分箱取最大高程值得到表面包络线，应用自适应窗口Savitzky-Golay滤波器平滑包络线，使用scipy.signal.find_peaks检测主峰顶点，运行坑底探测与反弹判定算法定位边缘基点，计算宽度、起伏和高宽比，对时间序列进行中心化滚动平均平滑。</w:t>
       </w:r>
     </w:p>
     <w:p>
@@ -689,7 +356,7 @@
           <w:color w:val="000000"/>
           <w:sz w:val="21"/>
         </w:rPr>
-        <w:t>用户完成环境配置后，需要从原始模拟数据中提取盐体运动学指标。执行本步骤后，软件自动读取所有实验组的数据文件，计算每帧的盐体宽度、起伏和高宽比。</w:t>
+        <w:t>提取结果以CSV格式保存运动学指标数据，以PKL格式缓存每帧的剖面数据和特征点坐标，用于后续质控和绘图步骤。</w:t>
       </w:r>
     </w:p>
     <w:p>
@@ -699,7 +366,7 @@
           <w:color w:val="000000"/>
           <w:sz w:val="21"/>
         </w:rPr>
-        <w:t>该部分提供终端显示处理进度条（tqdm进度条）、终端日志输出，格式为HH:MM:SS [LEVEL] message和终端显示每组的文件数量、采样进度和采样后帧数等页面内容，用户可据此查看状态、填写信息或选择下一步操作。</w:t>
+        <w:t>操作步骤：</w:t>
       </w:r>
     </w:p>
     <w:p>
@@ -709,7 +376,7 @@
           <w:color w:val="000000"/>
           <w:sz w:val="21"/>
         </w:rPr>
-        <w:t>在该页面中，用户先在终端中执行python 01_data_extractor.py命令，随后软件自动遍历.env中配置的所有实验组，接着对每个实验组的 data 目录，按文件名编号顺序读取所有.dat文件，之后软件解析粒子坐标数据，通过分箱统计提取表面包络线，再应用峰值检测算法定位盐丘顶点，应用坑底追踪算法定位基点，继续计算宽度、起伏和高宽比三个运动学指标，继续对时间序列指标进行滚动平均平滑处理，最后将结果存储为 CSV 文件（kinematics_data.csv）和 PKL 缓存文件（profiles_cache.pkl）。</w:t>
+        <w:t>1）确保.env已正确配置且数据目录已按实验组组织好。</w:t>
       </w:r>
     </w:p>
     <w:p>
@@ -719,7 +386,47 @@
           <w:color w:val="000000"/>
           <w:sz w:val="21"/>
         </w:rPr>
-        <w:t>如果不满足每个实验组的 data 目录必须存在且包含至少一个.dat文件、.dat文件必须为 ZDEM 离散元模拟输出的标准格式和.env文件中的目录路径必须有效等要求，用户需要根据页面提示调整后再继续。页面反馈通常包括终端实时显示 tqdm 进度条，反映当前处理的组别和文件数量、日志输出每组处理完成信息，显示原始帧数和采样后帧数和处理完成后在实验组目录下生成kinematics_data.csv和profiles_cache.pkl文件。</w:t>
+        <w:t>2）在终端中执行python 01_data_extractor.py。</w:t>
+      </w:r>
+    </w:p>
+    <w:p>
+      <w:r>
+        <w:rPr>
+          <w:rFonts w:ascii="SimSun" w:hAnsi="SimSun" w:eastAsia="SimSun"/>
+          <w:color w:val="000000"/>
+          <w:sz w:val="21"/>
+        </w:rPr>
+        <w:t>3）查看终端显示的tqdm进度条和日志，日志格式为HH:MM:SS [INFO] 描述信息。</w:t>
+      </w:r>
+    </w:p>
+    <w:p>
+      <w:r>
+        <w:rPr>
+          <w:rFonts w:ascii="SimSun" w:hAnsi="SimSun" w:eastAsia="SimSun"/>
+          <w:color w:val="000000"/>
+          <w:sz w:val="21"/>
+        </w:rPr>
+        <w:t>4）等待处理完成，日志会显示每个实验组的原始帧数、采样帧数和数据存储路径。</w:t>
+      </w:r>
+    </w:p>
+    <w:p>
+      <w:r>
+        <w:rPr>
+          <w:rFonts w:ascii="SimSun" w:hAnsi="SimSun" w:eastAsia="SimSun"/>
+          <w:color w:val="000000"/>
+          <w:sz w:val="21"/>
+        </w:rPr>
+        <w:t>5）在实验组目录下检查生成的kinematics_data.csv和profiles_cache.pkl文件。</w:t>
+      </w:r>
+    </w:p>
+    <w:p>
+      <w:r>
+        <w:rPr>
+          <w:rFonts w:ascii="SimSun" w:hAnsi="SimSun" w:eastAsia="SimSun"/>
+          <w:color w:val="000000"/>
+          <w:sz w:val="21"/>
+        </w:rPr>
+        <w:t>完成数据提取后，用户可继续进入交互式质控修正或直接生成诊断图表。</w:t>
       </w:r>
     </w:p>
     <w:p>
@@ -734,13 +441,13 @@
     </w:p>
     <w:p>
       <w:pPr>
-        <w:pStyle w:val="Heading2"/>
+        <w:pStyle w:val="Heading3"/>
       </w:pPr>
       <w:r>
         <w:rPr>
           <w:color w:val="000000"/>
         </w:rPr>
-        <w:t>七、交互式质控修正</w:t>
+        <w:t>3. 交互式质控修正</w:t>
       </w:r>
     </w:p>
     <w:p>
@@ -750,7 +457,7 @@
           <w:color w:val="000000"/>
           <w:sz w:val="21"/>
         </w:rPr>
-        <w:t>用户可在交互式质控修正页面以交互式图形界面逐帧展示算法识别结果，支持用户通过鼠标点击修正基点位置。用户在终端中执行python 01b_manual_corrector.py命令，软件弹出 Matplotlib 交互窗口。</w:t>
+        <w:t>交互式质控功能用于对算法自动识别的基点位置进行人工检查和微调。软件以Matplotlib图形窗口逐帧展示当前时间步的盐体粒子分布散点图，叠加显示算法识别的峰顶标记和基点标记，底部状态栏显示当前帧编号、鼠标操作提示和快捷键说明。</w:t>
       </w:r>
     </w:p>
     <w:p>
@@ -760,7 +467,7 @@
           <w:color w:val="000000"/>
           <w:sz w:val="21"/>
         </w:rPr>
-        <w:t>数据提取完成后，研究者需要检查算法自动识别的基点是否准确。如果某些帧的基点定位有偏差，用户可以通过质控界面手动修正。</w:t>
+        <w:t>用户通过鼠标左键点击盐体表面任意位置可重新设定基点坐标，右键点击可撤销上一步修正。按S键或Enter键保存当前帧结果并自动加载下一帧，按A键返回上一帧。</w:t>
       </w:r>
     </w:p>
     <w:p>
@@ -770,7 +477,7 @@
           <w:color w:val="000000"/>
           <w:sz w:val="21"/>
         </w:rPr>
-        <w:t>页面上主要呈现 Matplotlib 图形窗口，显示当前帧的盐体粒子分布散点图、算法自动识别的峰顶位置（标记点）、算法自动识别的基点位置（标记点）和底部显示当前帧编号、快捷键提示和操作状态等内容，这些内容用于帮助用户确认当前位置和可执行操作。</w:t>
+        <w:t>操作步骤：</w:t>
       </w:r>
     </w:p>
     <w:p>
@@ -780,7 +487,7 @@
           <w:color w:val="000000"/>
           <w:sz w:val="21"/>
         </w:rPr>
-        <w:t>实际操作时，用户先执行python 01b_manual_corrector.py启动交互界面，随后软件自动加载第一帧的数据和算法识别结果，接着在图形窗口中查看盐体粒子分布和特征点标注，之后如需修正基点：鼠标左键点击盐体表面任意位置，基点自动更新为点击坐标，再如需撤销修正：鼠标右键点击恢复上一步操作，继续检查无误后按 S 键或 Enter 键保存当前帧的修正结果，继续软件自动加载下一帧，重复检查和修正过程，最后所有帧处理完毕后关闭窗口，修正后的数据自动保存到缓存文件。</w:t>
+        <w:t>1）确保数据提取步骤已完成，实验组目录下存在profiles_cache.pkl文件。</w:t>
       </w:r>
     </w:p>
     <w:p>
@@ -790,7 +497,77 @@
           <w:color w:val="000000"/>
           <w:sz w:val="21"/>
         </w:rPr>
-        <w:t>操作过程中需要注意修正前需确保数据提取步骤已执行完成，存在profiles_cache.pkl文件和点击修正时应在盐体粒子分布区域内点击。操作完成后，系统会显示鼠标左键点击后基点标记立即移动到新位置、右下角状态区域显示当前帧号和操作提示、按 S 键后显示'已保存'提示并自动切换到下一帧和全部帧处理完成后窗口自动关闭。</w:t>
+        <w:t>2）在终端中执行python 01b_manual_corrector.py。</w:t>
+      </w:r>
+    </w:p>
+    <w:p>
+      <w:r>
+        <w:rPr>
+          <w:rFonts w:ascii="SimSun" w:hAnsi="SimSun" w:eastAsia="SimSun"/>
+          <w:color w:val="000000"/>
+          <w:sz w:val="21"/>
+        </w:rPr>
+        <w:t>3）在图形窗口中查看当前帧的盐体粒子分布和特征点标记。</w:t>
+      </w:r>
+    </w:p>
+    <w:p>
+      <w:r>
+        <w:rPr>
+          <w:rFonts w:ascii="SimSun" w:hAnsi="SimSun" w:eastAsia="SimSun"/>
+          <w:color w:val="000000"/>
+          <w:sz w:val="21"/>
+        </w:rPr>
+        <w:t>4）如基点位置有偏差，鼠标左键点击盐体表面正确位置。</w:t>
+      </w:r>
+    </w:p>
+    <w:p>
+      <w:r>
+        <w:rPr>
+          <w:rFonts w:ascii="SimSun" w:hAnsi="SimSun" w:eastAsia="SimSun"/>
+          <w:color w:val="000000"/>
+          <w:sz w:val="21"/>
+        </w:rPr>
+        <w:t>5）如误操作，鼠标右键点击撤销。</w:t>
+      </w:r>
+    </w:p>
+    <w:p>
+      <w:r>
+        <w:rPr>
+          <w:rFonts w:ascii="SimSun" w:hAnsi="SimSun" w:eastAsia="SimSun"/>
+          <w:color w:val="000000"/>
+          <w:sz w:val="21"/>
+        </w:rPr>
+        <w:t>6）检查无误后按S键或Enter键保存，软件自动加载下一帧。</w:t>
+      </w:r>
+    </w:p>
+    <w:p>
+      <w:r>
+        <w:rPr>
+          <w:rFonts w:ascii="SimSun" w:hAnsi="SimSun" w:eastAsia="SimSun"/>
+          <w:color w:val="000000"/>
+          <w:sz w:val="21"/>
+        </w:rPr>
+        <w:t>7）重复步骤3至6，直至所有帧检查完毕。</w:t>
+      </w:r>
+    </w:p>
+    <w:p>
+      <w:r>
+        <w:rPr>
+          <w:rFonts w:ascii="SimSun" w:hAnsi="SimSun" w:eastAsia="SimSun"/>
+          <w:color w:val="000000"/>
+          <w:sz w:val="21"/>
+        </w:rPr>
+        <w:t>8）关闭图形窗口，修正后的数据自动保存到缓存文件。</w:t>
+      </w:r>
+    </w:p>
+    <w:p>
+      <w:r>
+        <w:rPr>
+          <w:rFonts w:ascii="SimSun" w:hAnsi="SimSun" w:eastAsia="SimSun"/>
+          <w:color w:val="000000"/>
+          <w:sz w:val="21"/>
+        </w:rPr>
+        <w:t>质控修正完成后，修正后的基点坐标将用于后续诊断图表的生成。</w:t>
       </w:r>
     </w:p>
     <w:p>
@@ -805,13 +582,13 @@
     </w:p>
     <w:p>
       <w:pPr>
-        <w:pStyle w:val="Heading2"/>
+        <w:pStyle w:val="Heading3"/>
       </w:pPr>
       <w:r>
         <w:rPr>
           <w:color w:val="000000"/>
         </w:rPr>
-        <w:t>八、单组诊断绘图</w:t>
+        <w:t>4. 单组诊断绘图</w:t>
       </w:r>
     </w:p>
     <w:p>
@@ -821,7 +598,7 @@
           <w:color w:val="000000"/>
           <w:sz w:val="21"/>
         </w:rPr>
-        <w:t>用户可在单组诊断绘图页面为每个实验组生成运动学演化轨迹图和盐体剖面多宫格诊断图。用户在终端中执行python 02_plot_single_diagnostic.py命令。</w:t>
+        <w:t>单组诊断绘图功能用于为每个实验组生成运动学演化轨迹图和盐体剖面多宫格诊断图。软件读取kinematics_data.csv和profiles_cache.pkl中的数据，绘制高宽比随缩短量变化的演化曲线（采用Y轴右置学术风格，出露前实线、出露后虚线标识），以及按时间步排列的剖面形态多宫格对比图。</w:t>
       </w:r>
     </w:p>
     <w:p>
@@ -831,7 +608,7 @@
           <w:color w:val="000000"/>
           <w:sz w:val="21"/>
         </w:rPr>
-        <w:t>数据提取和质控完成后，研究者需要生成可视化图表用于分析盐体演化规律和论文发表。</w:t>
+        <w:t>演化轨迹图以600 DPI输出，剖面诊断图以300 DPI输出，均保存为PNG格式。</w:t>
       </w:r>
     </w:p>
     <w:p>
@@ -841,7 +618,7 @@
           <w:color w:val="000000"/>
           <w:sz w:val="21"/>
         </w:rPr>
-        <w:t>用户在单组诊断绘图页面会看到终端显示各组绘图进度日志和输出目录中出现 PNG 格式图表文件等信息，并可依据页面显示继续处理。</w:t>
+        <w:t>操作步骤：</w:t>
       </w:r>
     </w:p>
     <w:p>
@@ -851,7 +628,7 @@
           <w:color w:val="000000"/>
           <w:sz w:val="21"/>
         </w:rPr>
-        <w:t>使用该功能时，用户先执行python 02_plot_single_diagnostic.py命令，随后软件读取每个实验组的kinematics_data.csv数据，接着生成运动学演化轨迹图（Kinematic_Evolution_Diagnostic.png），展示该组的高宽比随时间变化，之后生成盐体剖面多宫格诊断图（Salt_Profiles_Diagnostic_Grid.png），以多宫格形式展示不同时刻步的盐体轮廓和特征点，最后图表自动保存到对应实验组的输出目录中。</w:t>
+        <w:t>1）确保实验组目录下存在kinematics_data.csv数据文件。</w:t>
       </w:r>
     </w:p>
     <w:p>
@@ -861,7 +638,37 @@
           <w:color w:val="000000"/>
           <w:sz w:val="21"/>
         </w:rPr>
-        <w:t>页面会按照每个实验组目录下需存在kinematics_data.csv数据文件和图表输出目录需有写入权限等规则限制或提示用户。处理结束后，用户可以看到终端日志显示每个实验组的绘图进度和完成后在实验组目录中可查看生成的 PNG 图表文件。</w:t>
+        <w:t>2）在终端中执行python 02_plot_single_diagnostic.py。</w:t>
+      </w:r>
+    </w:p>
+    <w:p>
+      <w:r>
+        <w:rPr>
+          <w:rFonts w:ascii="SimSun" w:hAnsi="SimSun" w:eastAsia="SimSun"/>
+          <w:color w:val="000000"/>
+          <w:sz w:val="21"/>
+        </w:rPr>
+        <w:t>3）查看终端日志显示的绘图进度。</w:t>
+      </w:r>
+    </w:p>
+    <w:p>
+      <w:r>
+        <w:rPr>
+          <w:rFonts w:ascii="SimSun" w:hAnsi="SimSun" w:eastAsia="SimSun"/>
+          <w:color w:val="000000"/>
+          <w:sz w:val="21"/>
+        </w:rPr>
+        <w:t>4）在实验组目录下查看生成的Kinematic_Evolution_Diagnostic.png和Salt_Profiles_Diagnostic_Grid.png。</w:t>
+      </w:r>
+    </w:p>
+    <w:p>
+      <w:r>
+        <w:rPr>
+          <w:rFonts w:ascii="SimSun" w:hAnsi="SimSun" w:eastAsia="SimSun"/>
+          <w:color w:val="000000"/>
+          <w:sz w:val="21"/>
+        </w:rPr>
+        <w:t>完成单组诊断后，用户可查看图表分析本组盐体的演化特征，或继续执行多组联合比对。</w:t>
       </w:r>
     </w:p>
     <w:p>
@@ -876,13 +683,13 @@
     </w:p>
     <w:p>
       <w:pPr>
-        <w:pStyle w:val="Heading2"/>
+        <w:pStyle w:val="Heading3"/>
       </w:pPr>
       <w:r>
         <w:rPr>
           <w:color w:val="000000"/>
         </w:rPr>
-        <w:t>九、多组联合比对</w:t>
+        <w:t>5. 多组联合比对</w:t>
       </w:r>
     </w:p>
     <w:p>
@@ -892,7 +699,7 @@
           <w:color w:val="000000"/>
           <w:sz w:val="21"/>
         </w:rPr>
-        <w:t>用户可在多组联合比对页面将所有实验组的运动学指标绘制到同一张对比图中，支持跨组比较分析。用户在终端中执行python 03_plot_multi_comparison.py命令。</w:t>
+        <w:t>多组联合比对功能用于将所有实验组的运动学指标绘制到同一坐标系中进行横向比较。软件基于ProcessPoolExecutor多进程并行加载各组的CSV数据，在同一图中按不同颜色和标记绘制各组的高宽比、起伏和宽度的演化曲线，每张图同时输出PNG位图和PDF矢量图。</w:t>
       </w:r>
     </w:p>
     <w:p>
@@ -902,7 +709,7 @@
           <w:color w:val="000000"/>
           <w:sz w:val="21"/>
         </w:rPr>
-        <w:t>当用户有多个实验组（如不同缩短速率、不同盐层厚度等参数对比）时，需要将各组结果放到一起比较，观察参数变化对盐体演化的影响。</w:t>
+        <w:t>该功能适合对比不同缩短速率、不同盐层厚度等参数条件下盐体演化行为的差异。</w:t>
       </w:r>
     </w:p>
     <w:p>
@@ -912,7 +719,7 @@
           <w:color w:val="000000"/>
           <w:sz w:val="21"/>
         </w:rPr>
-        <w:t>该部分提供终端显示各组数据加载和绘图进度日志和输出目录中出现多组对比的 PNG 和 PDF 图表文件等页面内容，用户可据此查看状态、填写信息或选择下一步操作。</w:t>
+        <w:t>操作步骤：</w:t>
       </w:r>
     </w:p>
     <w:p>
@@ -922,7 +729,7 @@
           <w:color w:val="000000"/>
           <w:sz w:val="21"/>
         </w:rPr>
-        <w:t>在该页面中，用户先执行python 03_plot_multi_comparison.py命令，随后软件自动加载所有实验组的kinematics_data.csv数据，接着在同一坐标系中绘制各组的高宽比演化曲线，使用不同颜色和标记区分，之后在同一坐标系中绘制各组的起伏演化曲线，再在同一坐标系中绘制各组的宽度演化曲线，最后每张图同时输出高分辨率PNG（位图）和PDF（矢量图）两种格式。</w:t>
+        <w:t>1）确保所有实验组目录下均存在kinematics_data.csv文件。</w:t>
       </w:r>
     </w:p>
     <w:p>
@@ -932,7 +739,37 @@
           <w:color w:val="000000"/>
           <w:sz w:val="21"/>
         </w:rPr>
-        <w:t>如果不满足至少需要两个实验组的数据才能生成有意义的对比图和各实验组的kinematics_data.csv文件必须存在等要求，用户需要根据页面提示调整后再继续。页面反馈通常包括终端日志显示当前处理的数据组和绘图完成信息和完成后在输出目录中可查看Multi_Evolution系列图表文件。</w:t>
+        <w:t>2）在终端中执行python 03_plot_multi_comparison.py。</w:t>
+      </w:r>
+    </w:p>
+    <w:p>
+      <w:r>
+        <w:rPr>
+          <w:rFonts w:ascii="SimSun" w:hAnsi="SimSun" w:eastAsia="SimSun"/>
+          <w:color w:val="000000"/>
+          <w:sz w:val="21"/>
+        </w:rPr>
+        <w:t>3）查看终端日志显示的各组数据加载和绘图完成信息。</w:t>
+      </w:r>
+    </w:p>
+    <w:p>
+      <w:r>
+        <w:rPr>
+          <w:rFonts w:ascii="SimSun" w:hAnsi="SimSun" w:eastAsia="SimSun"/>
+          <w:color w:val="000000"/>
+          <w:sz w:val="21"/>
+        </w:rPr>
+        <w:t>4）在输出目录下查看Multi_Evolution_HalfWidth、Multi_Evolution_Relief、Multi_Evolution_AspectRatio三个系列的PNG和PDF文件。</w:t>
+      </w:r>
+    </w:p>
+    <w:p>
+      <w:r>
+        <w:rPr>
+          <w:rFonts w:ascii="SimSun" w:hAnsi="SimSun" w:eastAsia="SimSun"/>
+          <w:color w:val="000000"/>
+          <w:sz w:val="21"/>
+        </w:rPr>
+        <w:t>完成多组对比后，用户可直接使用PNG或PDF文件用于学术论文发表。</w:t>
       </w:r>
     </w:p>
     <w:p>
@@ -953,7 +790,7 @@
         <w:rPr>
           <w:color w:val="000000"/>
         </w:rPr>
-        <w:t>十、典型使用流程</w:t>
+        <w:t>结果查看与注意事项</w:t>
       </w:r>
     </w:p>
     <w:p>
@@ -963,7 +800,18 @@
           <w:color w:val="000000"/>
           <w:sz w:val="21"/>
         </w:rPr>
-        <w:t>用户完成一次完整业务时，通常先进入 ZDEM 盐体运动学分析系统，再选择或创建业务对象，随后按照页面提示处理内容并查看结果。</w:t>
+        <w:t>数据提取结果保存到各实验组目录下，包括kinematics_data.csv（运动学指标表格）和profiles_cache.pkl（剖面缓存）。诊断图表保存到各实验组目录和总输出目录。</w:t>
+      </w:r>
+    </w:p>
+    <w:p>
+      <w:pPr>
+        <w:pStyle w:val="Heading3"/>
+      </w:pPr>
+      <w:r>
+        <w:rPr>
+          <w:color w:val="000000"/>
+        </w:rPr>
+        <w:t>运动学指标说明</w:t>
       </w:r>
     </w:p>
     <w:p>
@@ -973,109 +821,769 @@
           <w:color w:val="000000"/>
           <w:sz w:val="21"/>
         </w:rPr>
-        <w:t>配置环境变量：复制.env.example为.env，设置数据目录路径和实验组配置；运行数据提取：执行01_data_extractor.py，批量解析.dat文件，生成 CSV 指标表和 PKL 缓存；人工质控修正：执行01b_manual_corrector.py，交互式检查并修正特征点定位；单组诊断出图：执行02_plot_single_diagnostic.py，生成演化曲线和剖面诊断图。</w:t>
+        <w:t>本软件以ZDEM离散元粒子坐标数据为基础，通过表面包络线提取和特征点定位获得盐丘几何参数，进而计算运动学演化指标。数据提取结果和诊断图表中的主要指标含义如下表所示。</w:t>
       </w:r>
     </w:p>
+    <w:tbl>
+      <w:tblPr>
+        <w:tblStyle w:val="TableGrid"/>
+        <w:tblW w:type="auto" w:w="0"/>
+        <w:tblLook w:firstColumn="1" w:firstRow="1" w:lastColumn="0" w:lastRow="0" w:noHBand="0" w:noVBand="1" w:val="04A0"/>
+      </w:tblPr>
+      <w:tblGrid>
+        <w:gridCol w:w="1734"/>
+        <w:gridCol w:w="1734"/>
+        <w:gridCol w:w="1734"/>
+        <w:gridCol w:w="1734"/>
+        <w:gridCol w:w="1734"/>
+      </w:tblGrid>
+      <w:tr>
+        <w:tc>
+          <w:tcPr>
+            <w:tcW w:type="dxa" w:w="1734"/>
+          </w:tcPr>
+          <w:p>
+            <w:r>
+              <w:rPr>
+                <w:color w:val="000000"/>
+              </w:rPr>
+              <w:t>序号</w:t>
+            </w:r>
+          </w:p>
+        </w:tc>
+        <w:tc>
+          <w:tcPr>
+            <w:tcW w:type="dxa" w:w="1734"/>
+          </w:tcPr>
+          <w:p>
+            <w:r>
+              <w:rPr>
+                <w:color w:val="000000"/>
+              </w:rPr>
+              <w:t>指标名称</w:t>
+            </w:r>
+          </w:p>
+        </w:tc>
+        <w:tc>
+          <w:tcPr>
+            <w:tcW w:type="dxa" w:w="1734"/>
+          </w:tcPr>
+          <w:p>
+            <w:r>
+              <w:rPr>
+                <w:color w:val="000000"/>
+              </w:rPr>
+              <w:t>CSV字段名</w:t>
+            </w:r>
+          </w:p>
+        </w:tc>
+        <w:tc>
+          <w:tcPr>
+            <w:tcW w:type="dxa" w:w="1734"/>
+          </w:tcPr>
+          <w:p>
+            <w:r>
+              <w:rPr>
+                <w:color w:val="000000"/>
+              </w:rPr>
+              <w:t>指标含义</w:t>
+            </w:r>
+          </w:p>
+        </w:tc>
+        <w:tc>
+          <w:tcPr>
+            <w:tcW w:type="dxa" w:w="1734"/>
+          </w:tcPr>
+          <w:p>
+            <w:r>
+              <w:rPr>
+                <w:color w:val="000000"/>
+              </w:rPr>
+              <w:t>计算方式或说明</w:t>
+            </w:r>
+          </w:p>
+        </w:tc>
+      </w:tr>
+      <w:tr>
+        <w:tc>
+          <w:tcPr>
+            <w:tcW w:type="dxa" w:w="1734"/>
+          </w:tcPr>
+          <w:p>
+            <w:r>
+              <w:rPr>
+                <w:color w:val="000000"/>
+              </w:rPr>
+              <w:t>1</w:t>
+            </w:r>
+          </w:p>
+        </w:tc>
+        <w:tc>
+          <w:tcPr>
+            <w:tcW w:type="dxa" w:w="1734"/>
+          </w:tcPr>
+          <w:p>
+            <w:r>
+              <w:rPr>
+                <w:color w:val="000000"/>
+              </w:rPr>
+              <w:t>时间步</w:t>
+            </w:r>
+          </w:p>
+        </w:tc>
+        <w:tc>
+          <w:tcPr>
+            <w:tcW w:type="dxa" w:w="1734"/>
+          </w:tcPr>
+          <w:p>
+            <w:r>
+              <w:rPr>
+                <w:color w:val="000000"/>
+              </w:rPr>
+              <w:t>step</w:t>
+            </w:r>
+          </w:p>
+        </w:tc>
+        <w:tc>
+          <w:tcPr>
+            <w:tcW w:type="dxa" w:w="1734"/>
+          </w:tcPr>
+          <w:p>
+            <w:r>
+              <w:rPr>
+                <w:color w:val="000000"/>
+              </w:rPr>
+              <w:t>当前分析对应的ZDEM输出时间步编号。</w:t>
+            </w:r>
+          </w:p>
+        </w:tc>
+        <w:tc>
+          <w:tcPr>
+            <w:tcW w:type="dxa" w:w="1734"/>
+          </w:tcPr>
+          <w:p>
+            <w:r>
+              <w:rPr>
+                <w:color w:val="000000"/>
+              </w:rPr>
+              <w:t>由.dat文件名中的数字编号识别得到。</w:t>
+            </w:r>
+          </w:p>
+        </w:tc>
+      </w:tr>
+      <w:tr>
+        <w:tc>
+          <w:tcPr>
+            <w:tcW w:type="dxa" w:w="1734"/>
+          </w:tcPr>
+          <w:p>
+            <w:r>
+              <w:rPr>
+                <w:color w:val="000000"/>
+              </w:rPr>
+              <w:t>2</w:t>
+            </w:r>
+          </w:p>
+        </w:tc>
+        <w:tc>
+          <w:tcPr>
+            <w:tcW w:type="dxa" w:w="1734"/>
+          </w:tcPr>
+          <w:p>
+            <w:r>
+              <w:rPr>
+                <w:color w:val="000000"/>
+              </w:rPr>
+              <w:t>主峰X坐标</w:t>
+            </w:r>
+          </w:p>
+        </w:tc>
+        <w:tc>
+          <w:tcPr>
+            <w:tcW w:type="dxa" w:w="1734"/>
+          </w:tcPr>
+          <w:p>
+            <w:r>
+              <w:rPr>
+                <w:color w:val="000000"/>
+              </w:rPr>
+              <w:t>top_x</w:t>
+            </w:r>
+          </w:p>
+        </w:tc>
+        <w:tc>
+          <w:tcPr>
+            <w:tcW w:type="dxa" w:w="1734"/>
+          </w:tcPr>
+          <w:p>
+            <w:r>
+              <w:rPr>
+                <w:color w:val="000000"/>
+              </w:rPr>
+              <w:t>盐丘剖面顶点的水平位置。</w:t>
+            </w:r>
+          </w:p>
+        </w:tc>
+        <w:tc>
+          <w:tcPr>
+            <w:tcW w:type="dxa" w:w="1734"/>
+          </w:tcPr>
+          <w:p>
+            <w:r>
+              <w:rPr>
+                <w:color w:val="000000"/>
+              </w:rPr>
+              <w:t>对平滑后的包络线应用find_peaks检测最显著峰值得到。</w:t>
+            </w:r>
+          </w:p>
+        </w:tc>
+      </w:tr>
+      <w:tr>
+        <w:tc>
+          <w:tcPr>
+            <w:tcW w:type="dxa" w:w="1734"/>
+          </w:tcPr>
+          <w:p>
+            <w:r>
+              <w:rPr>
+                <w:color w:val="000000"/>
+              </w:rPr>
+              <w:t>3</w:t>
+            </w:r>
+          </w:p>
+        </w:tc>
+        <w:tc>
+          <w:tcPr>
+            <w:tcW w:type="dxa" w:w="1734"/>
+          </w:tcPr>
+          <w:p>
+            <w:r>
+              <w:rPr>
+                <w:color w:val="000000"/>
+              </w:rPr>
+              <w:t>主峰高程</w:t>
+            </w:r>
+          </w:p>
+        </w:tc>
+        <w:tc>
+          <w:tcPr>
+            <w:tcW w:type="dxa" w:w="1734"/>
+          </w:tcPr>
+          <w:p>
+            <w:r>
+              <w:rPr>
+                <w:color w:val="000000"/>
+              </w:rPr>
+              <w:t>top_y</w:t>
+            </w:r>
+          </w:p>
+        </w:tc>
+        <w:tc>
+          <w:tcPr>
+            <w:tcW w:type="dxa" w:w="1734"/>
+          </w:tcPr>
+          <w:p>
+            <w:r>
+              <w:rPr>
+                <w:color w:val="000000"/>
+              </w:rPr>
+              <w:t>盐丘剖面顶点的高程值。</w:t>
+            </w:r>
+          </w:p>
+        </w:tc>
+        <w:tc>
+          <w:tcPr>
+            <w:tcW w:type="dxa" w:w="1734"/>
+          </w:tcPr>
+          <w:p>
+            <w:r>
+              <w:rPr>
+                <w:color w:val="000000"/>
+              </w:rPr>
+              <w:t>包络线在主峰X坐标处的高程值。</w:t>
+            </w:r>
+          </w:p>
+        </w:tc>
+      </w:tr>
+      <w:tr>
+        <w:tc>
+          <w:tcPr>
+            <w:tcW w:type="dxa" w:w="1734"/>
+          </w:tcPr>
+          <w:p>
+            <w:r>
+              <w:rPr>
+                <w:color w:val="000000"/>
+              </w:rPr>
+              <w:t>4</w:t>
+            </w:r>
+          </w:p>
+        </w:tc>
+        <w:tc>
+          <w:tcPr>
+            <w:tcW w:type="dxa" w:w="1734"/>
+          </w:tcPr>
+          <w:p>
+            <w:r>
+              <w:rPr>
+                <w:color w:val="000000"/>
+              </w:rPr>
+              <w:t>基点X坐标</w:t>
+            </w:r>
+          </w:p>
+        </w:tc>
+        <w:tc>
+          <w:tcPr>
+            <w:tcW w:type="dxa" w:w="1734"/>
+          </w:tcPr>
+          <w:p>
+            <w:r>
+              <w:rPr>
+                <w:color w:val="000000"/>
+              </w:rPr>
+              <w:t>base_x</w:t>
+            </w:r>
+          </w:p>
+        </w:tc>
+        <w:tc>
+          <w:tcPr>
+            <w:tcW w:type="dxa" w:w="1734"/>
+          </w:tcPr>
+          <w:p>
+            <w:r>
+              <w:rPr>
+                <w:color w:val="000000"/>
+              </w:rPr>
+              <w:t>盐丘边缘向斜最低点的水平位置。</w:t>
+            </w:r>
+          </w:p>
+        </w:tc>
+        <w:tc>
+          <w:tcPr>
+            <w:tcW w:type="dxa" w:w="1734"/>
+          </w:tcPr>
+          <w:p>
+            <w:r>
+              <w:rPr>
+                <w:color w:val="000000"/>
+              </w:rPr>
+              <w:t>采用坑底探测与反弹判定算法从峰顶向外扫描得到。</w:t>
+            </w:r>
+          </w:p>
+        </w:tc>
+      </w:tr>
+      <w:tr>
+        <w:tc>
+          <w:tcPr>
+            <w:tcW w:type="dxa" w:w="1734"/>
+          </w:tcPr>
+          <w:p>
+            <w:r>
+              <w:rPr>
+                <w:color w:val="000000"/>
+              </w:rPr>
+              <w:t>5</w:t>
+            </w:r>
+          </w:p>
+        </w:tc>
+        <w:tc>
+          <w:tcPr>
+            <w:tcW w:type="dxa" w:w="1734"/>
+          </w:tcPr>
+          <w:p>
+            <w:r>
+              <w:rPr>
+                <w:color w:val="000000"/>
+              </w:rPr>
+              <w:t>基点高程</w:t>
+            </w:r>
+          </w:p>
+        </w:tc>
+        <w:tc>
+          <w:tcPr>
+            <w:tcW w:type="dxa" w:w="1734"/>
+          </w:tcPr>
+          <w:p>
+            <w:r>
+              <w:rPr>
+                <w:color w:val="000000"/>
+              </w:rPr>
+              <w:t>base_y</w:t>
+            </w:r>
+          </w:p>
+        </w:tc>
+        <w:tc>
+          <w:tcPr>
+            <w:tcW w:type="dxa" w:w="1734"/>
+          </w:tcPr>
+          <w:p>
+            <w:r>
+              <w:rPr>
+                <w:color w:val="000000"/>
+              </w:rPr>
+              <w:t>盐丘边缘向斜最低点的高程值。</w:t>
+            </w:r>
+          </w:p>
+        </w:tc>
+        <w:tc>
+          <w:tcPr>
+            <w:tcW w:type="dxa" w:w="1734"/>
+          </w:tcPr>
+          <w:p>
+            <w:r>
+              <w:rPr>
+                <w:color w:val="000000"/>
+              </w:rPr>
+              <w:t>包络线在基点X坐标处的高程值。</w:t>
+            </w:r>
+          </w:p>
+        </w:tc>
+      </w:tr>
+      <w:tr>
+        <w:tc>
+          <w:tcPr>
+            <w:tcW w:type="dxa" w:w="1734"/>
+          </w:tcPr>
+          <w:p>
+            <w:r>
+              <w:rPr>
+                <w:color w:val="000000"/>
+              </w:rPr>
+              <w:t>6</w:t>
+            </w:r>
+          </w:p>
+        </w:tc>
+        <w:tc>
+          <w:tcPr>
+            <w:tcW w:type="dxa" w:w="1734"/>
+          </w:tcPr>
+          <w:p>
+            <w:r>
+              <w:rPr>
+                <w:color w:val="000000"/>
+              </w:rPr>
+              <w:t>起伏</w:t>
+            </w:r>
+          </w:p>
+        </w:tc>
+        <w:tc>
+          <w:tcPr>
+            <w:tcW w:type="dxa" w:w="1734"/>
+          </w:tcPr>
+          <w:p>
+            <w:r>
+              <w:rPr>
+                <w:color w:val="000000"/>
+              </w:rPr>
+              <w:t>relief</w:t>
+            </w:r>
+          </w:p>
+        </w:tc>
+        <w:tc>
+          <w:tcPr>
+            <w:tcW w:type="dxa" w:w="1734"/>
+          </w:tcPr>
+          <w:p>
+            <w:r>
+              <w:rPr>
+                <w:color w:val="000000"/>
+              </w:rPr>
+              <w:t>盐丘顶点到基点的高程差，反映盐体的隆起程度。</w:t>
+            </w:r>
+          </w:p>
+        </w:tc>
+        <w:tc>
+          <w:tcPr>
+            <w:tcW w:type="dxa" w:w="1734"/>
+          </w:tcPr>
+          <w:p>
+            <w:r>
+              <w:rPr>
+                <w:color w:val="000000"/>
+              </w:rPr>
+              <w:t>relief = top_y - base_y。数值增大表示盐体持续抬升。</w:t>
+            </w:r>
+          </w:p>
+        </w:tc>
+      </w:tr>
+      <w:tr>
+        <w:tc>
+          <w:tcPr>
+            <w:tcW w:type="dxa" w:w="1734"/>
+          </w:tcPr>
+          <w:p>
+            <w:r>
+              <w:rPr>
+                <w:color w:val="000000"/>
+              </w:rPr>
+              <w:t>7</w:t>
+            </w:r>
+          </w:p>
+        </w:tc>
+        <w:tc>
+          <w:tcPr>
+            <w:tcW w:type="dxa" w:w="1734"/>
+          </w:tcPr>
+          <w:p>
+            <w:r>
+              <w:rPr>
+                <w:color w:val="000000"/>
+              </w:rPr>
+              <w:t>宽度</w:t>
+            </w:r>
+          </w:p>
+        </w:tc>
+        <w:tc>
+          <w:tcPr>
+            <w:tcW w:type="dxa" w:w="1734"/>
+          </w:tcPr>
+          <w:p>
+            <w:r>
+              <w:rPr>
+                <w:color w:val="000000"/>
+              </w:rPr>
+              <w:t>half_width</w:t>
+            </w:r>
+          </w:p>
+        </w:tc>
+        <w:tc>
+          <w:tcPr>
+            <w:tcW w:type="dxa" w:w="1734"/>
+          </w:tcPr>
+          <w:p>
+            <w:r>
+              <w:rPr>
+                <w:color w:val="000000"/>
+              </w:rPr>
+              <w:t>盐丘顶点到基点的水平距离，反映盐体的横向展布范围。</w:t>
+            </w:r>
+          </w:p>
+        </w:tc>
+        <w:tc>
+          <w:tcPr>
+            <w:tcW w:type="dxa" w:w="1734"/>
+          </w:tcPr>
+          <w:p>
+            <w:r>
+              <w:rPr>
+                <w:color w:val="000000"/>
+              </w:rPr>
+              <w:t>half_width = abs(top_x - base_x)。随构造缩短而变化。</w:t>
+            </w:r>
+          </w:p>
+        </w:tc>
+      </w:tr>
+      <w:tr>
+        <w:tc>
+          <w:tcPr>
+            <w:tcW w:type="dxa" w:w="1734"/>
+          </w:tcPr>
+          <w:p>
+            <w:r>
+              <w:rPr>
+                <w:color w:val="000000"/>
+              </w:rPr>
+              <w:t>8</w:t>
+            </w:r>
+          </w:p>
+        </w:tc>
+        <w:tc>
+          <w:tcPr>
+            <w:tcW w:type="dxa" w:w="1734"/>
+          </w:tcPr>
+          <w:p>
+            <w:r>
+              <w:rPr>
+                <w:color w:val="000000"/>
+              </w:rPr>
+              <w:t>高宽比</w:t>
+            </w:r>
+          </w:p>
+        </w:tc>
+        <w:tc>
+          <w:tcPr>
+            <w:tcW w:type="dxa" w:w="1734"/>
+          </w:tcPr>
+          <w:p>
+            <w:r>
+              <w:rPr>
+                <w:color w:val="000000"/>
+              </w:rPr>
+              <w:t>aspect_ratio</w:t>
+            </w:r>
+          </w:p>
+        </w:tc>
+        <w:tc>
+          <w:tcPr>
+            <w:tcW w:type="dxa" w:w="1734"/>
+          </w:tcPr>
+          <w:p>
+            <w:r>
+              <w:rPr>
+                <w:color w:val="000000"/>
+              </w:rPr>
+              <w:t>盐体起伏与半宽的比值，衡量盐丘形态的演化阶段。</w:t>
+            </w:r>
+          </w:p>
+        </w:tc>
+        <w:tc>
+          <w:tcPr>
+            <w:tcW w:type="dxa" w:w="1734"/>
+          </w:tcPr>
+          <w:p>
+            <w:r>
+              <w:rPr>
+                <w:color w:val="000000"/>
+              </w:rPr>
+              <w:t>aspect_ratio = relief / half_width。数值增大表示盐体从低缓隆起向高耸形态发展。</w:t>
+            </w:r>
+          </w:p>
+        </w:tc>
+      </w:tr>
+      <w:tr>
+        <w:tc>
+          <w:tcPr>
+            <w:tcW w:type="dxa" w:w="1734"/>
+          </w:tcPr>
+          <w:p>
+            <w:r>
+              <w:rPr>
+                <w:color w:val="000000"/>
+              </w:rPr>
+              <w:t>9</w:t>
+            </w:r>
+          </w:p>
+        </w:tc>
+        <w:tc>
+          <w:tcPr>
+            <w:tcW w:type="dxa" w:w="1734"/>
+          </w:tcPr>
+          <w:p>
+            <w:r>
+              <w:rPr>
+                <w:color w:val="000000"/>
+              </w:rPr>
+              <w:t>缩短量</w:t>
+            </w:r>
+          </w:p>
+        </w:tc>
+        <w:tc>
+          <w:tcPr>
+            <w:tcW w:type="dxa" w:w="1734"/>
+          </w:tcPr>
+          <w:p>
+            <w:r>
+              <w:rPr>
+                <w:color w:val="000000"/>
+              </w:rPr>
+              <w:t>shortening</w:t>
+            </w:r>
+          </w:p>
+        </w:tc>
+        <w:tc>
+          <w:tcPr>
+            <w:tcW w:type="dxa" w:w="1734"/>
+          </w:tcPr>
+          <w:p>
+            <w:r>
+              <w:rPr>
+                <w:color w:val="000000"/>
+              </w:rPr>
+              <w:t>推板自初始位置以来的水平位移量。</w:t>
+            </w:r>
+          </w:p>
+        </w:tc>
+        <w:tc>
+          <w:tcPr>
+            <w:tcW w:type="dxa" w:w="1734"/>
+          </w:tcPr>
+          <w:p>
+            <w:r>
+              <w:rPr>
+                <w:color w:val="000000"/>
+              </w:rPr>
+              <w:t>由墙体位置的变化量计算得到，作为演化曲线的横轴。</w:t>
+            </w:r>
+          </w:p>
+        </w:tc>
+      </w:tr>
+      <w:tr>
+        <w:tc>
+          <w:tcPr>
+            <w:tcW w:type="dxa" w:w="1734"/>
+          </w:tcPr>
+          <w:p>
+            <w:r>
+              <w:rPr>
+                <w:color w:val="000000"/>
+              </w:rPr>
+              <w:t>10</w:t>
+            </w:r>
+          </w:p>
+        </w:tc>
+        <w:tc>
+          <w:tcPr>
+            <w:tcW w:type="dxa" w:w="1734"/>
+          </w:tcPr>
+          <w:p>
+            <w:r>
+              <w:rPr>
+                <w:color w:val="000000"/>
+              </w:rPr>
+              <w:t>采样帧</w:t>
+            </w:r>
+          </w:p>
+        </w:tc>
+        <w:tc>
+          <w:tcPr>
+            <w:tcW w:type="dxa" w:w="1734"/>
+          </w:tcPr>
+          <w:p>
+            <w:r>
+              <w:rPr>
+                <w:color w:val="000000"/>
+              </w:rPr>
+              <w:t>sampled_frame</w:t>
+            </w:r>
+          </w:p>
+        </w:tc>
+        <w:tc>
+          <w:tcPr>
+            <w:tcW w:type="dxa" w:w="1734"/>
+          </w:tcPr>
+          <w:p>
+            <w:r>
+              <w:rPr>
+                <w:color w:val="000000"/>
+              </w:rPr>
+              <w:t>按时间步间隔采样后保留的分析帧编号。</w:t>
+            </w:r>
+          </w:p>
+        </w:tc>
+        <w:tc>
+          <w:tcPr>
+            <w:tcW w:type="dxa" w:w="1734"/>
+          </w:tcPr>
+          <w:p>
+            <w:r>
+              <w:rPr>
+                <w:color w:val="000000"/>
+              </w:rPr>
+              <w:t>原数据帧数较多时，按出露前和出露后分别等距采样以减少冗余。</w:t>
+            </w:r>
+          </w:p>
+        </w:tc>
+      </w:tr>
+    </w:tbl>
     <w:p>
       <w:pPr>
-        <w:pStyle w:val="Heading2"/>
+        <w:pStyle w:val="Heading3"/>
       </w:pPr>
       <w:r>
         <w:rPr>
           <w:color w:val="000000"/>
         </w:rPr>
-        <w:t>十一、常见问题解答</w:t>
-      </w:r>
-    </w:p>
-    <w:p>
-      <w:r>
-        <w:rPr>
-          <w:rFonts w:ascii="SimSun" w:hAnsi="SimSun" w:eastAsia="SimSun"/>
-          <w:color w:val="000000"/>
-          <w:sz w:val="21"/>
-        </w:rPr>
-        <w:t>问题：软件支持哪些格式的输入数据？</w:t>
-      </w:r>
-    </w:p>
-    <w:p>
-      <w:r>
-        <w:rPr>
-          <w:rFonts w:ascii="SimSun" w:hAnsi="SimSun" w:eastAsia="SimSun"/>
-          <w:color w:val="000000"/>
-          <w:sz w:val="21"/>
-        </w:rPr>
-        <w:t>解决方法：本软件专为 ZDEM 离散元模拟输出的.dat格式粒子数据设计。每个.dat文件包含该时刻步所有粒子的 X 坐标和 Y 坐标（或其他等效字段），格式为纯文本。用户需要将数据按实验组组织到 data 子目录中，文件按模拟时间步编号命名（如0001.dat）。</w:t>
-      </w:r>
-    </w:p>
-    <w:p>
-      <w:r>
-        <w:rPr>
-          <w:rFonts w:ascii="SimSun" w:hAnsi="SimSun" w:eastAsia="SimSun"/>
-          <w:color w:val="000000"/>
-          <w:sz w:val="21"/>
-        </w:rPr>
-        <w:t>问题：如何处理算法自动识别的基点不准确的情况？</w:t>
-      </w:r>
-    </w:p>
-    <w:p>
-      <w:r>
-        <w:rPr>
-          <w:rFonts w:ascii="SimSun" w:hAnsi="SimSun" w:eastAsia="SimSun"/>
-          <w:color w:val="000000"/>
-          <w:sz w:val="21"/>
-        </w:rPr>
-        <w:t>解决方法：运行01b_manual_corrector.py进入交互式质控界面。在图形窗口中，点击盐体表面任意位置即可重新设定基点坐标，右键点击可撤销上一步操作。修正完成后按 S 键或 Enter 键保存当前帧结果，软件会自动加载下一帧。建议对所有关键帧进行检查。</w:t>
-      </w:r>
-    </w:p>
-    <w:p>
-      <w:r>
-        <w:rPr>
-          <w:rFonts w:ascii="SimSun" w:hAnsi="SimSun" w:eastAsia="SimSun"/>
-          <w:color w:val="000000"/>
-          <w:sz w:val="21"/>
-        </w:rPr>
-        <w:t>问题：为什么运行时提示找不到配置文件？</w:t>
-      </w:r>
-    </w:p>
-    <w:p>
-      <w:r>
-        <w:rPr>
-          <w:rFonts w:ascii="SimSun" w:hAnsi="SimSun" w:eastAsia="SimSun"/>
-          <w:color w:val="000000"/>
-          <w:sz w:val="21"/>
-        </w:rPr>
-        <w:t>解决方法：软件通过.env文件读取配置参数。首次使用前需要将.env.example文件复制为.env，然后修改其中的FINAL_OUTPUT_DIR为实际数据存放路径。确保.env文件位于软件根目录下。</w:t>
-      </w:r>
-    </w:p>
-    <w:p>
-      <w:r>
-        <w:rPr>
-          <w:rFonts w:ascii="SimSun" w:hAnsi="SimSun" w:eastAsia="SimSun"/>
-          <w:color w:val="000000"/>
-          <w:sz w:val="21"/>
-        </w:rPr>
-        <w:t>问题：生成的图表分辨率可以调整吗？</w:t>
-      </w:r>
-    </w:p>
-    <w:p>
-      <w:r>
-        <w:rPr>
-          <w:rFonts w:ascii="SimSun" w:hAnsi="SimSun" w:eastAsia="SimSun"/>
-          <w:color w:val="000000"/>
-          <w:sz w:val="21"/>
-        </w:rPr>
-        <w:t>解决方法：单组诊断图默认以600 DPI输出，剖面诊断图以300 DPI输出，多组对比图同时输出 PNG 位图和 PDF 矢量图。如需调整分辨率，可以在.env配置文件中设置相关参数。</w:t>
-      </w:r>
-    </w:p>
-    <w:p>
-      <w:pPr>
-        <w:pStyle w:val="Heading2"/>
-      </w:pPr>
-      <w:r>
-        <w:rPr>
-          <w:color w:val="000000"/>
-        </w:rPr>
-        <w:t>十二、术语表</w:t>
+        <w:t>术语表</w:t>
       </w:r>
     </w:p>
     <w:tbl>
@@ -1139,7 +1647,7 @@
               <w:rPr>
                 <w:color w:val="000000"/>
               </w:rPr>
-              <w:t>中-离散元方法(Zhong-Discrete Element Method)，一种用于模拟地质构造变形过程的数值方法，通过大量离散粒子模拟岩层的受力变形行为。</w:t>
+              <w:t>中-离散元方法(Zhong-Discrete Element Method)，一种用于模拟地质构造变形过程的数值方法。</w:t>
             </w:r>
           </w:p>
         </w:tc>
@@ -1167,7 +1675,7 @@
               <w:rPr>
                 <w:color w:val="000000"/>
               </w:rPr>
-              <w:t>地下盐层在构造挤压或重力作用下向上隆起形成的穹隆状构造体。盐丘的几何形态演化是构造地质学的重要研究内容。</w:t>
+              <w:t>地下盐层在构造挤压或重力作用下向上隆起形成的穹隆状构造体。</w:t>
             </w:r>
           </w:p>
         </w:tc>
@@ -1195,7 +1703,7 @@
               <w:rPr>
                 <w:color w:val="000000"/>
               </w:rPr>
-              <w:t>盐丘剖面上的最高点，即盐体向上隆起的最顶端位置，是运动学分析的关键参考点。</w:t>
+              <w:t>盐丘剖面上的最高点，即盐体隆起的顶端位置。</w:t>
             </w:r>
           </w:p>
         </w:tc>
@@ -1223,7 +1731,7 @@
               <w:rPr>
                 <w:color w:val="000000"/>
               </w:rPr>
-              <w:t>盐丘两侧的凹陷最低点，标志着盐体隆起的横向边界。准确识别基点是计算盐体宽度和起伏的前提。</w:t>
+              <w:t>盐丘两侧的凹陷最低点，标志盐体隆起的横向边界。</w:t>
             </w:r>
           </w:p>
         </w:tc>
@@ -1251,7 +1759,7 @@
               <w:rPr>
                 <w:color w:val="000000"/>
               </w:rPr>
-              <w:t>盐体的起伏高度与半宽的比值，是衡量盐丘形态演化阶段的核心无量纲指标。高宽比的变化反映盐体从低缓隆起到高耸刺穿的演化过程。</w:t>
+              <w:t>盐体起伏高度与半宽的比值，衡量盐丘形态演化阶段的核心无量纲指标。</w:t>
             </w:r>
           </w:p>
         </w:tc>
@@ -1279,12 +1787,22 @@
               <w:rPr>
                 <w:color w:val="000000"/>
               </w:rPr>
-              <w:t>一种基于局部多项式拟合的数据平滑方法，在保持信号峰形特征的同时有效滤除高频噪声。本软件用它平滑盐体剖面轮廓线。</w:t>
+              <w:t>基于局部多项式拟合的数据平滑方法，在保持峰形特征的同时滤除高频噪声。</w:t>
             </w:r>
           </w:p>
         </w:tc>
       </w:tr>
     </w:tbl>
+    <w:p>
+      <w:r>
+        <w:rPr>
+          <w:rFonts w:ascii="SimSun" w:hAnsi="SimSun" w:eastAsia="SimSun"/>
+          <w:color w:val="000000"/>
+          <w:sz w:val="21"/>
+        </w:rPr>
+        <w:t>【截图预留：请在上述标注位置插入对应截图。】</w:t>
+      </w:r>
+    </w:p>
     <w:sectPr>
       <w:headerReference w:type="default" r:id="rId9"/>
       <w:footerReference w:type="default" r:id="rId10"/>

</xml_diff>